<commit_message>
feat(curriculum): make prerequisite practice sheets student-facing
Prerequisite practice sheets (A/B, Sessions 1-2, Word and PDF, 54 lessons) move out of the teacher-only folder into each lesson's public downloads and get their own 'Prerequisite practice' group in the units browser, the lesson desk and the bulk downloader. Answer keys stay teacher-only. The importer gains a prerequisite category and a --prerequisite partial mode that leaves every other download untouched. District 2.6 sheets and key, which live on site lesson 2-3, are headed Lesson 2-3 (Word and PDF) to match the rest of that lesson's documents.

Claude-Session: https://claude.ai/code/session_019q9Zh3V76LQ2BJMD71La4K
</commit_message>
<xml_diff>
--- a/lessons/2-3/downloads/reveal/teacher/2.6-prerequisite-practice-answer-key.docx
+++ b/lessons/2-3/downloads/reveal/teacher/2.6-prerequisite-practice-answer-key.docx
@@ -16,7 +16,7 @@
           <w:sz w:val="22"/>
           <w:szCs w:val="19"/>
         </w:rPr>
-        <w:t xml:space="preserve">Lesson 2-6  ·  Prerequisite Practice  ·  Answer Key</w:t>
+        <w:t xml:space="preserve">Lesson 2-3  ·  Prerequisite Practice  ·  Answer Key</w:t>
       </w:r>
     </w:p>
     <w:p>
@@ -1475,7 +1475,7 @@
               <w:sz w:val="15"/>
               <w:szCs w:val="15"/>
             </w:rPr>
-            <w:t xml:space="preserve">2-6 · Page </w:t>
+            <w:t xml:space="preserve">2-3 · Page </w:t>
           </w:r>
           <w:r>
             <w:rPr>

</xml_diff>